<commit_message>
Deixa a data da procuracao em branco e o VENDEDOR em preto
A procuracao sai com dia, mes e ano em branco para o cliente
preencher a mao, e a linha da firma desce para longe da data.
No contrato, o tema escuro pintava de claro o texto da tabela de
assinaturas e o VENDEDOR sumia no papel; agora ele sai preto.

Co-Authored-By: Claude Opus 5.5 <noreply@anthropic.com>
</commit_message>
<xml_diff>
--- a/public/templates/procuracao.docx
+++ b/public/templates/procuracao.docx
@@ -986,7 +986,7 @@
           <w:rFonts w:asciiTheme="minorHAnsi" w:eastAsiaTheme="minorHAnsi" w:hAnsiTheme="minorHAnsi" w:cstheme="minorHAnsi"/>
           <w:sz w:val="20"/>
         </w:rPr>
-        <w:t>São José dos Campos, {data_extenso}.</w:t>
+        <w:t xml:space="preserve">São José dos Campos,                    de                                                            de 20              .</w:t>
       </w:r>
     </w:p>
     <w:p>
@@ -1030,7 +1030,7 @@
     <w:p>
       <w:pPr>
         <w:widowControl w:val="0"/>
-        <w:spacing w:after="100" w:line="360" w:lineRule="auto" w:before="840"/>
+        <w:spacing w:before="1134" w:after="100" w:line="360" w:lineRule="auto"/>
         <w:jc w:val="left"/>
         <w:rPr>
           <w:rFonts w:asciiTheme="minorHAnsi" w:eastAsiaTheme="minorHAnsi" w:hAnsiTheme="minorHAnsi" w:cstheme="minorHAnsi"/>

</xml_diff>